<commit_message>
Dokument Word w pierwszej osobie, jako propozycja autorki dla Dyrektora
Co-Authored-By: Claude Opus 5.5 <noreply@anthropic.com>
Claude-Session: https://claude.ai/code/session_011aWSbiCtwpjPEh9iDiqQqv
</commit_message>
<xml_diff>
--- a/GA_Mapa_procesu_i_weryfikacji.docx
+++ b/GA_Mapa_procesu_i_weryfikacji.docx
@@ -13,7 +13,7 @@
           <w:sz w:val="18"/>
           <w:szCs w:val="18"/>
         </w:rPr>
-        <w:t xml:space="preserve">GRUPA AZOTY · SEGMENT NAWOZY · MATERIAŁ ROBOCZY</w:t>
+        <w:t xml:space="preserve">GRUPA AZOTY · SEGMENT NAWOZY · PROPOZYCJA WSPARCIA PROCESU INTEGRACJI</w:t>
       </w:r>
     </w:p>
     <w:p>
@@ -40,10 +40,34 @@
       <w:r>
         <w:rPr>
           <w:rFonts w:ascii="Calibri" w:cs="Calibri" w:eastAsia="Calibri" w:hAnsi="Calibri"/>
+          <w:b/>
+          <w:bCs/>
           <w:sz w:val="20"/>
           <w:szCs w:val="20"/>
         </w:rPr>
-        <w:t xml:space="preserve">Gdzie są zakłady, kiedy jest sezon, jak towar i dane płyną od rolnika do gotówki, na jakich narzędziach pracują ludzie i w których 7 miejscach można sprawdzić, jak to wygląda naprawdę.</w:t>
+        <w:t xml:space="preserve">Angelika Pruchniak</w:t>
+      </w:r>
+      <w:r>
+        <w:rPr>
+          <w:rFonts w:ascii="Calibri" w:cs="Calibri" w:eastAsia="Calibri" w:hAnsi="Calibri"/>
+          <w:color w:val="5B6861"/>
+          <w:sz w:val="20"/>
+          <w:szCs w:val="20"/>
+        </w:rPr>
+        <w:t xml:space="preserve"> · Manager ds. projektów strategicznych · październik 2026</w:t>
+      </w:r>
+    </w:p>
+    <w:p>
+      <w:pPr>
+        <w:spacing w:after="120" w:before="0"/>
+      </w:pPr>
+      <w:r>
+        <w:rPr>
+          <w:rFonts w:ascii="Calibri" w:cs="Calibri" w:eastAsia="Calibri" w:hAnsi="Calibri"/>
+          <w:sz w:val="20"/>
+          <w:szCs w:val="20"/>
+        </w:rPr>
+        <w:t xml:space="preserve">W tym dokumencie pokazuję, jak widzę proces w segmencie Nawozy: gdzie są zakłady, kiedy jest sezon, jak towar i dane płyną od rolnika do gotówki i na jakich narzędziach pracują ludzie. Wskazuję też 7 miejsc, w których mogę sprawdzić, jak ta praca wygląda w rzeczywistości, i w ten sposób wesprzeć proces integracji.</w:t>
       </w:r>
     </w:p>
     <w:p>
@@ -140,7 +164,7 @@
           <w:sz w:val="20"/>
           <w:szCs w:val="20"/>
         </w:rPr>
-        <w:t xml:space="preserve">punkt weryfikacji</w:t>
+        <w:t xml:space="preserve">punkt, w którym weryfikuję proces</w:t>
       </w:r>
     </w:p>
     <w:p>
@@ -530,7 +554,7 @@
           <w:sz w:val="20"/>
           <w:szCs w:val="20"/>
         </w:rPr>
-        <w:t xml:space="preserve">Słupki pokazują typowy rytm rynku i nie są danymi Grupy. Dokładne miesiące potwierdź z handlem.</w:t>
+        <w:t xml:space="preserve">Słupki pokazują typowy rytm rynku i nie są danymi Grupy. Dokładne miesiące potwierdzę z działem handlu.</w:t>
       </w:r>
     </w:p>
     <w:p>
@@ -550,7 +574,7 @@
           <w:sz w:val="20"/>
           <w:szCs w:val="20"/>
         </w:rPr>
-        <w:t xml:space="preserve">Najmocniejszy argument na spotkanie. </w:t>
+        <w:t xml:space="preserve">Dlaczego teraz. </w:t>
       </w:r>
       <w:r>
         <w:rPr>
@@ -558,7 +582,7 @@
           <w:sz w:val="20"/>
           <w:szCs w:val="20"/>
         </w:rPr>
-        <w:t xml:space="preserve">Twoje 4 miesiące (październik–styczeń) to dokładnie czas przygotowania do wiosennego szczytu. Wtedy powstaje plan na wiosnę, zapełniają się magazyny i dystrybutorzy składają kontrakty. Jeśli coś ma się poprawić przed marcem, to musi to być widoczne właśnie w tym okresie, i możesz to sprawdzić na żywo.</w:t>
+        <w:t xml:space="preserve">Mój okres w projekcie (październik–styczeń) przypada dokładnie na przygotowanie do wiosennego szczytu. Wtedy powstaje plan na wiosnę, zapełniają się magazyny i dystrybutorzy składają kontrakty. Jeśli coś ma się poprawić przed marcem, musi to być widoczne właśnie w tym okresie. Dzięki temu mogę obserwować procesy na żywo, w momencie, który dla wyniku sezonu liczy się najbardziej.</w:t>
       </w:r>
     </w:p>
     <w:p>
@@ -788,7 +812,7 @@
                 <w:sz w:val="20"/>
                 <w:szCs w:val="20"/>
               </w:rPr>
-              <w:t xml:space="preserve">Weryfikacja</w:t>
+              <w:t xml:space="preserve">Moja weryfikacja</w:t>
             </w:r>
           </w:p>
         </w:tc>
@@ -2214,7 +2238,7 @@
           <w:sz w:val="20"/>
           <w:szCs w:val="20"/>
         </w:rPr>
-        <w:t xml:space="preserve">W każdym punkcie metoda jest ta sama: siadasz obok osoby, która wykonuje pracę, i prosisz, żeby pokazała jeden prawdziwy przypadek na ekranie, od początku do końca. Nie oceniasz ludzi, tylko mierzysz, ile kroków i przepisywania wymaga proces.</w:t>
+        <w:t xml:space="preserve">W każdym punkcie stosuję tę samą metodę: siadam obok osoby, która wykonuje daną pracę, i proszę, żeby pokazała mi jeden prawdziwy przypadek na ekranie, od początku do końca. Nie oceniam ludzi. Mierzę, ile kroków, plików i ręcznego przepisywania wymaga proces.</w:t>
       </w:r>
     </w:p>
     <w:p>
@@ -2284,7 +2308,7 @@
                 <w:sz w:val="20"/>
                 <w:szCs w:val="20"/>
               </w:rPr>
-              <w:t xml:space="preserve">Z kim</w:t>
+              <w:t xml:space="preserve">Z kim rozmawiam</w:t>
             </w:r>
           </w:p>
         </w:tc>
@@ -2352,7 +2376,7 @@
                 <w:sz w:val="20"/>
                 <w:szCs w:val="20"/>
               </w:rPr>
-              <w:t xml:space="preserve">Poproś, żeby pokazali</w:t>
+              <w:t xml:space="preserve">O co poproszę</w:t>
             </w:r>
           </w:p>
         </w:tc>
@@ -2420,7 +2444,7 @@
                 <w:sz w:val="20"/>
                 <w:szCs w:val="20"/>
               </w:rPr>
-              <w:t xml:space="preserve">Co zmierzyć</w:t>
+              <w:t xml:space="preserve">Co mierzę</w:t>
             </w:r>
           </w:p>
         </w:tc>
@@ -2806,7 +2830,7 @@
                 <w:sz w:val="20"/>
                 <w:szCs w:val="20"/>
               </w:rPr>
-              <w:t xml:space="preserve">Z kim</w:t>
+              <w:t xml:space="preserve">Z kim rozmawiam</w:t>
             </w:r>
           </w:p>
         </w:tc>
@@ -2874,7 +2898,7 @@
                 <w:sz w:val="20"/>
                 <w:szCs w:val="20"/>
               </w:rPr>
-              <w:t xml:space="preserve">Poproś, żeby pokazali</w:t>
+              <w:t xml:space="preserve">O co poproszę</w:t>
             </w:r>
           </w:p>
         </w:tc>
@@ -2942,7 +2966,7 @@
                 <w:sz w:val="20"/>
                 <w:szCs w:val="20"/>
               </w:rPr>
-              <w:t xml:space="preserve">Co zmierzyć</w:t>
+              <w:t xml:space="preserve">Co mierzę</w:t>
             </w:r>
           </w:p>
         </w:tc>
@@ -3328,7 +3352,7 @@
                 <w:sz w:val="20"/>
                 <w:szCs w:val="20"/>
               </w:rPr>
-              <w:t xml:space="preserve">Z kim</w:t>
+              <w:t xml:space="preserve">Z kim rozmawiam</w:t>
             </w:r>
           </w:p>
         </w:tc>
@@ -3396,7 +3420,7 @@
                 <w:sz w:val="20"/>
                 <w:szCs w:val="20"/>
               </w:rPr>
-              <w:t xml:space="preserve">Poproś, żeby pokazali</w:t>
+              <w:t xml:space="preserve">O co poproszę</w:t>
             </w:r>
           </w:p>
         </w:tc>
@@ -3464,7 +3488,7 @@
                 <w:sz w:val="20"/>
                 <w:szCs w:val="20"/>
               </w:rPr>
-              <w:t xml:space="preserve">Co zmierzyć</w:t>
+              <w:t xml:space="preserve">Co mierzę</w:t>
             </w:r>
           </w:p>
         </w:tc>
@@ -3622,7 +3646,7 @@
                 <w:sz w:val="20"/>
                 <w:szCs w:val="20"/>
               </w:rPr>
-              <w:t xml:space="preserve">„Tylko ja wiem, jak to działa”. To ryzyko ciągłości dla całej Grupy i najmocniejszy argument za Twoją rolą.</w:t>
+              <w:t xml:space="preserve">„Tylko ja wiem, jak to działa”. To ryzyko ciągłości działania dla całej Grupy.</w:t>
             </w:r>
           </w:p>
         </w:tc>
@@ -3868,7 +3892,7 @@
                 <w:sz w:val="20"/>
                 <w:szCs w:val="20"/>
               </w:rPr>
-              <w:t xml:space="preserve">Z kim</w:t>
+              <w:t xml:space="preserve">Z kim rozmawiam</w:t>
             </w:r>
           </w:p>
         </w:tc>
@@ -3936,7 +3960,7 @@
                 <w:sz w:val="20"/>
                 <w:szCs w:val="20"/>
               </w:rPr>
-              <w:t xml:space="preserve">Poproś, żeby pokazali</w:t>
+              <w:t xml:space="preserve">O co poproszę</w:t>
             </w:r>
           </w:p>
         </w:tc>
@@ -4004,7 +4028,7 @@
                 <w:sz w:val="20"/>
                 <w:szCs w:val="20"/>
               </w:rPr>
-              <w:t xml:space="preserve">Co zmierzyć</w:t>
+              <w:t xml:space="preserve">Co mierzę</w:t>
             </w:r>
           </w:p>
         </w:tc>
@@ -4390,7 +4414,7 @@
                 <w:sz w:val="20"/>
                 <w:szCs w:val="20"/>
               </w:rPr>
-              <w:t xml:space="preserve">Z kim</w:t>
+              <w:t xml:space="preserve">Z kim rozmawiam</w:t>
             </w:r>
           </w:p>
         </w:tc>
@@ -4458,7 +4482,7 @@
                 <w:sz w:val="20"/>
                 <w:szCs w:val="20"/>
               </w:rPr>
-              <w:t xml:space="preserve">Poproś, żeby pokazali</w:t>
+              <w:t xml:space="preserve">O co poproszę</w:t>
             </w:r>
           </w:p>
         </w:tc>
@@ -4526,7 +4550,7 @@
                 <w:sz w:val="20"/>
                 <w:szCs w:val="20"/>
               </w:rPr>
-              <w:t xml:space="preserve">Co zmierzyć</w:t>
+              <w:t xml:space="preserve">Co mierzę</w:t>
             </w:r>
           </w:p>
         </w:tc>
@@ -4912,7 +4936,7 @@
                 <w:sz w:val="20"/>
                 <w:szCs w:val="20"/>
               </w:rPr>
-              <w:t xml:space="preserve">Z kim</w:t>
+              <w:t xml:space="preserve">Z kim rozmawiam</w:t>
             </w:r>
           </w:p>
         </w:tc>
@@ -4980,7 +5004,7 @@
                 <w:sz w:val="20"/>
                 <w:szCs w:val="20"/>
               </w:rPr>
-              <w:t xml:space="preserve">Poproś, żeby pokazali</w:t>
+              <w:t xml:space="preserve">O co poproszę</w:t>
             </w:r>
           </w:p>
         </w:tc>
@@ -5048,7 +5072,7 @@
                 <w:sz w:val="20"/>
                 <w:szCs w:val="20"/>
               </w:rPr>
-              <w:t xml:space="preserve">Co zmierzyć</w:t>
+              <w:t xml:space="preserve">Co mierzę</w:t>
             </w:r>
           </w:p>
         </w:tc>
@@ -5434,7 +5458,7 @@
                 <w:sz w:val="20"/>
                 <w:szCs w:val="20"/>
               </w:rPr>
-              <w:t xml:space="preserve">Z kim</w:t>
+              <w:t xml:space="preserve">Z kim rozmawiam</w:t>
             </w:r>
           </w:p>
         </w:tc>
@@ -5502,7 +5526,7 @@
                 <w:sz w:val="20"/>
                 <w:szCs w:val="20"/>
               </w:rPr>
-              <w:t xml:space="preserve">Poproś, żeby pokazali</w:t>
+              <w:t xml:space="preserve">O co poproszę</w:t>
             </w:r>
           </w:p>
         </w:tc>
@@ -5570,7 +5594,7 @@
                 <w:sz w:val="20"/>
                 <w:szCs w:val="20"/>
               </w:rPr>
-              <w:t xml:space="preserve">Co zmierzyć</w:t>
+              <w:t xml:space="preserve">Co mierzę</w:t>
             </w:r>
           </w:p>
         </w:tc>
@@ -5904,7 +5928,7 @@
           <w:sz w:val="30"/>
           <w:szCs w:val="30"/>
         </w:rPr>
-        <w:t xml:space="preserve">5. Jak i kiedy to zrobić w 4 miesiące</w:t>
+        <w:t xml:space="preserve">5. Jak i kiedy to zrobię: październik–styczeń</w:t>
       </w:r>
     </w:p>
     <w:p>
@@ -5922,7 +5946,7 @@
           <w:sz w:val="20"/>
           <w:szCs w:val="20"/>
         </w:rPr>
-        <w:t xml:space="preserve">Patrz, nie pytaj. Poproś, żeby pokazali pracę na prawdziwym przypadku z dzisiaj. Opowiadanie o procesie zawsze wygląda lepiej niż sam proces.</w:t>
+        <w:t xml:space="preserve">Obserwuję pracę, a nie tylko o nią pytam. Proszę o pokazanie prawdziwego przypadku z bieżącego dnia, bo opis procesu zawsze wygląda lepiej niż sam proces.</w:t>
       </w:r>
     </w:p>
     <w:p>
@@ -5940,7 +5964,7 @@
           <w:sz w:val="20"/>
           <w:szCs w:val="20"/>
         </w:rPr>
-        <w:t xml:space="preserve">Mierz trzy rzeczy: czas (ile trwa), kroki (ile kliknięć, plików, telefonów) i przepisywanie (ile razy ta sama liczba jest wpisywana ręcznie).</w:t>
+        <w:t xml:space="preserve">Mierzę trzy rzeczy: czas (ile trwa), kroki (ile kliknięć, plików, telefonów) i przepisywanie (ile razy ta sama liczba jest wpisywana ręcznie).</w:t>
       </w:r>
     </w:p>
     <w:p>
@@ -5958,7 +5982,7 @@
           <w:sz w:val="20"/>
           <w:szCs w:val="20"/>
         </w:rPr>
-        <w:t xml:space="preserve">Oddawaj wyniki. Po każdej wizycie wyślij krótką notatkę osobie, z którą rozmawiałaś, i jej przełożonemu, a podsumowanie także IT i McKinseyowi. To buduje zaufanie, a nie opór.</w:t>
+        <w:t xml:space="preserve">Dzielę się wynikami. Po każdej wizycie przekazuję krótką notatkę osobom, z którymi rozmawiałam, i ich przełożonym. Podsumowanie trafia także do działu IT i zespołu McKinsey, żeby nasze prace się uzupełniały, a nie dublowały.</w:t>
       </w:r>
     </w:p>
     <w:p>
@@ -6435,7 +6459,7 @@
         <w:sz w:val="16"/>
         <w:szCs w:val="16"/>
       </w:rPr>
-      <w:t xml:space="preserve">Mapa procesu Grupy Azoty · materiał roboczy · str. </w:t>
+      <w:t xml:space="preserve">Mapa procesu Grupy Azoty · Angelika Pruchniak · str. </w:t>
     </w:r>
     <w:r>
       <w:rPr>

</xml_diff>